<commit_message>
docs: actualizar credenciales especificas de login por rol en toda la documentacion
</commit_message>
<xml_diff>
--- a/MANUAL_DEL_USUARIO_RUBRICA.docx
+++ b/MANUAL_DEL_USUARIO_RUBRICA.docx
@@ -226,7 +226,7 @@
     </w:p>
     <w:p>
       <w:r>
-        <w:t>El Pulpazo es una aplicación web integral diseñada para optimizar la operación diaria de restaurantes y marisquerías. Permite administrar en tiempo real el plano de mesas, la toma de comandas, el cobro con desglose del IVA del 16%, el control de inventario con alertas de stock y la analítica ejecutiva. El objetivo de este manual es guiar de forma clara, sencilla y coloquial a cualquier miembro del personal en el uso correcto de la plataforma.</w:t>
+        <w:t>El Pulpazo es una aplicación web integral diseñada para optimizar la operación diaria de restaurantes y marisquerías. Permite controlar en tiempo real el plano de mesas, la toma de comandas, el cobro con desglose del IVA del 16%, el control de inventario con alertas de stock y la analítica ejecutiva. El objetivo de este manual es guiar de forma clara, sencilla y coloquial a cualquier miembro del personal en el uso correcto de la plataforma.</w:t>
       </w:r>
     </w:p>
     <w:p>
@@ -685,14 +685,16 @@
         <w:tblLook w:firstColumn="1" w:firstRow="1" w:lastColumn="0" w:lastRow="0" w:noHBand="0" w:noVBand="1" w:val="04A0"/>
       </w:tblPr>
       <w:tblGrid>
-        <w:gridCol w:w="3120"/>
-        <w:gridCol w:w="3120"/>
-        <w:gridCol w:w="3120"/>
+        <w:gridCol w:w="1872"/>
+        <w:gridCol w:w="1872"/>
+        <w:gridCol w:w="1872"/>
+        <w:gridCol w:w="1872"/>
+        <w:gridCol w:w="1872"/>
       </w:tblGrid>
       <w:tr>
         <w:tc>
           <w:tcPr>
-            <w:tcW w:type="dxa" w:w="3120"/>
+            <w:tcW w:type="dxa" w:w="1872"/>
             <w:shd w:fill="D4AF37"/>
           </w:tcPr>
           <w:p>
@@ -706,7 +708,35 @@
         </w:tc>
         <w:tc>
           <w:tcPr>
-            <w:tcW w:type="dxa" w:w="3120"/>
+            <w:tcW w:type="dxa" w:w="1872"/>
+            <w:shd w:fill="D4AF37"/>
+          </w:tcPr>
+          <w:p>
+            <w:r>
+              <w:rPr>
+                <w:b/>
+              </w:rPr>
+              <w:t>Correo de Acceso</w:t>
+            </w:r>
+          </w:p>
+        </w:tc>
+        <w:tc>
+          <w:tcPr>
+            <w:tcW w:type="dxa" w:w="1872"/>
+            <w:shd w:fill="D4AF37"/>
+          </w:tcPr>
+          <w:p>
+            <w:r>
+              <w:rPr>
+                <w:b/>
+              </w:rPr>
+              <w:t>Contraseña</w:t>
+            </w:r>
+          </w:p>
+        </w:tc>
+        <w:tc>
+          <w:tcPr>
+            <w:tcW w:type="dxa" w:w="1872"/>
             <w:shd w:fill="D4AF37"/>
           </w:tcPr>
           <w:p>
@@ -720,7 +750,7 @@
         </w:tc>
         <w:tc>
           <w:tcPr>
-            <w:tcW w:type="dxa" w:w="3120"/>
+            <w:tcW w:type="dxa" w:w="1872"/>
             <w:shd w:fill="D4AF37"/>
           </w:tcPr>
           <w:p>
@@ -736,7 +766,7 @@
       <w:tr>
         <w:tc>
           <w:tcPr>
-            <w:tcW w:type="dxa" w:w="3120"/>
+            <w:tcW w:type="dxa" w:w="1872"/>
           </w:tcPr>
           <w:p>
             <w:r>
@@ -746,7 +776,27 @@
         </w:tc>
         <w:tc>
           <w:tcPr>
-            <w:tcW w:type="dxa" w:w="3120"/>
+            <w:tcW w:type="dxa" w:w="1872"/>
+          </w:tcPr>
+          <w:p>
+            <w:r>
+              <w:t>admin@elpulpazo.com</w:t>
+            </w:r>
+          </w:p>
+        </w:tc>
+        <w:tc>
+          <w:tcPr>
+            <w:tcW w:type="dxa" w:w="1872"/>
+          </w:tcPr>
+          <w:p>
+            <w:r>
+              <w:t>admin@elpulpazo</w:t>
+            </w:r>
+          </w:p>
+        </w:tc>
+        <w:tc>
+          <w:tcPr>
+            <w:tcW w:type="dxa" w:w="1872"/>
           </w:tcPr>
           <w:p>
             <w:r>
@@ -756,7 +806,7 @@
         </w:tc>
         <w:tc>
           <w:tcPr>
-            <w:tcW w:type="dxa" w:w="3120"/>
+            <w:tcW w:type="dxa" w:w="1872"/>
           </w:tcPr>
           <w:p>
             <w:r>
@@ -768,17 +818,37 @@
       <w:tr>
         <w:tc>
           <w:tcPr>
-            <w:tcW w:type="dxa" w:w="3120"/>
+            <w:tcW w:type="dxa" w:w="1872"/>
           </w:tcPr>
           <w:p>
             <w:r>
-              <w:t>Cajera</w:t>
+              <w:t>Cajera / Cajero</w:t>
             </w:r>
           </w:p>
         </w:tc>
         <w:tc>
           <w:tcPr>
-            <w:tcW w:type="dxa" w:w="3120"/>
+            <w:tcW w:type="dxa" w:w="1872"/>
+          </w:tcPr>
+          <w:p>
+            <w:r>
+              <w:t>Cajero@Pulpazo.com</w:t>
+            </w:r>
+          </w:p>
+        </w:tc>
+        <w:tc>
+          <w:tcPr>
+            <w:tcW w:type="dxa" w:w="1872"/>
+          </w:tcPr>
+          <w:p>
+            <w:r>
+              <w:t>Cajero</w:t>
+            </w:r>
+          </w:p>
+        </w:tc>
+        <w:tc>
+          <w:tcPr>
+            <w:tcW w:type="dxa" w:w="1872"/>
           </w:tcPr>
           <w:p>
             <w:r>
@@ -788,7 +858,7 @@
         </w:tc>
         <w:tc>
           <w:tcPr>
-            <w:tcW w:type="dxa" w:w="3120"/>
+            <w:tcW w:type="dxa" w:w="1872"/>
           </w:tcPr>
           <w:p>
             <w:r>
@@ -800,7 +870,7 @@
       <w:tr>
         <w:tc>
           <w:tcPr>
-            <w:tcW w:type="dxa" w:w="3120"/>
+            <w:tcW w:type="dxa" w:w="1872"/>
           </w:tcPr>
           <w:p>
             <w:r>
@@ -810,7 +880,27 @@
         </w:tc>
         <w:tc>
           <w:tcPr>
-            <w:tcW w:type="dxa" w:w="3120"/>
+            <w:tcW w:type="dxa" w:w="1872"/>
+          </w:tcPr>
+          <w:p>
+            <w:r>
+              <w:t>mesero@elpulpazo.com</w:t>
+            </w:r>
+          </w:p>
+        </w:tc>
+        <w:tc>
+          <w:tcPr>
+            <w:tcW w:type="dxa" w:w="1872"/>
+          </w:tcPr>
+          <w:p>
+            <w:r>
+              <w:t>mesero123</w:t>
+            </w:r>
+          </w:p>
+        </w:tc>
+        <w:tc>
+          <w:tcPr>
+            <w:tcW w:type="dxa" w:w="1872"/>
           </w:tcPr>
           <w:p>
             <w:r>
@@ -820,7 +910,7 @@
         </w:tc>
         <w:tc>
           <w:tcPr>
-            <w:tcW w:type="dxa" w:w="3120"/>
+            <w:tcW w:type="dxa" w:w="1872"/>
           </w:tcPr>
           <w:p>
             <w:r>

</xml_diff>